<commit_message>
fix(deploy): runtime fixes found during server deployment
- add email-validator (Pydantic EmailStr)
- pin bcrypt==4.0.1 (passlib 1.7.4 incompatible with bcrypt>=4.1)
- Base.type_annotation_map -> TIMESTAMPTZ for all datetime columns (matches BAB 4; fixes tz-aware writes)
- drop 'from __future__ import annotations' in limiter routers (slowapi wrapper broke FastAPI body resolution -> 422)
- nginx: use 'listen ... ssl http2' (older nginx lacks 'http2 on')

Co-Authored-By: Claude Opus 4.8 <noreply@anthropic.com>
</commit_message>
<xml_diff>
--- a/Knowledge Base/dev_step_prompt.docx
+++ b/Knowledge Base/dev_step_prompt.docx
@@ -24681,6 +24681,25 @@
       <w:pPr>
         <w:spacing w:before="80"/>
       </w:pPr>
+      <w:r>
+        <w:rPr>
+          <w:rFonts w:ascii="Times" w:hAnsi="Times" w:cs="Times"/>
+          <w:sz w:val="24"/>
+          <w:sz-cs w:val="24"/>
+          <w:color w:val="000000"/>
+        </w:rPr>
+        <w:t xml:space="preserve">Tolong implementasikan ke server backend saya tapi pastikan tidak berdampak pada aplikasi saya yang sudah berjalan di server tersebut yang bernama xtracker,,jalankan command semacam ini untuk akses ke server backend saya : ssh -i /LightsailDefaultKey-ap-southeast-1.pem ubuntu@1</w:t>
+      </w:r>
+      <w:r>
+        <w:rPr>
+          <w:rFonts w:ascii="Helvetica Neue" w:hAnsi="Helvetica Neue" w:cs="Helvetica Neue"/>
+          <w:sz w:val="28"/>
+          <w:sz-cs w:val="28"/>
+          <w:spacing w:val="0"/>
+          <w:color w:val="0D1014"/>
+        </w:rPr>
+        <w:t xml:space="preserve">3.212.182.48</w:t>
+      </w:r>
       <w:r>
         <w:rPr>
           <w:rFonts w:ascii="Times" w:hAnsi="Times" w:cs="Times"/>

</xml_diff>